<commit_message>
chore: publish secure production build
</commit_message>
<xml_diff>
--- a/docs/Adversarial-Fraud-Arena-Solution.docx
+++ b/docs/Adversarial-Fraud-Arena-Solution.docx
@@ -1107,11 +1107,6 @@
     </w:tbl>
     <w:p>
       <w:pPr>
-        <w:spacing w:after="80" w:before="40"/>
-      </w:pPr>
-    </w:p>
-    <w:p>
-      <w:pPr>
         <w:pStyle w:val="Heading2"/>
       </w:pPr>
       <w:r>
@@ -1915,20 +1910,20 @@
                 <w:sz w:val="19"/>
                 <w:szCs w:val="19"/>
               </w:rPr>
-              <w:t xml:space="preserve">Deployment pending</w:t>
+              <w:t xml:space="preserve">Public build verified</w:t>
             </w:r>
           </w:p>
         </w:tc>
       </w:tr>
     </w:tbl>
     <w:p>
-      <w:pPr>
-        <w:spacing w:after="80" w:before="40"/>
-      </w:pPr>
-    </w:p>
-    <w:p>
-      <w:r>
-        <w:t xml:space="preserve">This matrix is an internal planning model. No public official weighted rubric was verified on 22 August 2026.</w:t>
+      <w:r>
+        <w:t xml:space="preserve">This matrix is internal. No official weighted rubric was public on 22 August 2026.</w:t>
+      </w:r>
+    </w:p>
+    <w:p>
+      <w:r>
+        <w:br w:type="page"/>
       </w:r>
     </w:p>
     <w:p>
@@ -3179,11 +3174,6 @@
     </w:tbl>
     <w:p>
       <w:pPr>
-        <w:spacing w:after="80" w:before="40"/>
-      </w:pPr>
-    </w:p>
-    <w:p>
-      <w:pPr>
         <w:pStyle w:val="Heading2"/>
       </w:pPr>
       <w:r>
@@ -3885,11 +3875,6 @@
     </w:tbl>
     <w:p>
       <w:pPr>
-        <w:spacing w:after="80" w:before="40"/>
-      </w:pPr>
-    </w:p>
-    <w:p>
-      <w:pPr>
         <w:pStyle w:val="Heading2"/>
       </w:pPr>
       <w:r>
@@ -3996,6 +3981,11 @@
       </w:pPr>
       <w:r>
         <w:t xml:space="preserve">Select the next parents from measured outcomes.</w:t>
+      </w:r>
+    </w:p>
+    <w:p>
+      <w:r>
+        <w:br w:type="page"/>
       </w:r>
     </w:p>
     <w:p>
@@ -4650,11 +4640,6 @@
     </w:tbl>
     <w:p>
       <w:pPr>
-        <w:spacing w:after="80" w:before="40"/>
-      </w:pPr>
-    </w:p>
-    <w:p>
-      <w:pPr>
         <w:pStyle w:val="Heading2"/>
       </w:pPr>
       <w:r>
@@ -5085,11 +5070,6 @@
         </w:tc>
       </w:tr>
     </w:tbl>
-    <w:p>
-      <w:pPr>
-        <w:spacing w:after="80" w:before="40"/>
-      </w:pPr>
-    </w:p>
     <w:p>
       <w:r>
         <w:br w:type="page"/>
@@ -6962,11 +6942,6 @@
         </w:tc>
       </w:tr>
     </w:tbl>
-    <w:p>
-      <w:pPr>
-        <w:spacing w:after="80" w:before="40"/>
-      </w:pPr>
-    </w:p>
     <w:p>
       <w:r>
         <w:br w:type="page"/>
@@ -7660,11 +7635,6 @@
     </w:tbl>
     <w:p>
       <w:pPr>
-        <w:spacing w:after="80" w:before="40"/>
-      </w:pPr>
-    </w:p>
-    <w:p>
-      <w:pPr>
         <w:pStyle w:val="Heading2"/>
       </w:pPr>
       <w:r>
@@ -8138,11 +8108,6 @@
         </w:tc>
       </w:tr>
     </w:tbl>
-    <w:p>
-      <w:pPr>
-        <w:spacing w:after="80" w:before="40"/>
-      </w:pPr>
-    </w:p>
     <w:p>
       <w:pPr>
         <w:shd w:fill="EAF3FA" w:color="auto" w:val="clear"/>
@@ -8754,11 +8719,6 @@
       </w:tr>
     </w:tbl>
     <w:p>
-      <w:pPr>
-        <w:spacing w:after="80" w:before="40"/>
-      </w:pPr>
-    </w:p>
-    <w:p>
       <w:r>
         <w:t xml:space="preserve">Four of five descendants improved. One descendant showed no change. The result meets the 80 percent survival gate.</w:t>
       </w:r>
@@ -9443,11 +9403,6 @@
         </w:tc>
       </w:tr>
     </w:tbl>
-    <w:p>
-      <w:pPr>
-        <w:spacing w:after="80" w:before="40"/>
-      </w:pPr>
-    </w:p>
     <w:p>
       <w:pPr>
         <w:shd w:fill="EAF3FA" w:color="auto" w:val="clear"/>
@@ -10054,11 +10009,6 @@
       </w:tr>
     </w:tbl>
     <w:p>
-      <w:pPr>
-        <w:spacing w:after="80" w:before="40"/>
-      </w:pPr>
-    </w:p>
-    <w:p>
       <w:r>
         <w:t xml:space="preserve">The benchmark measures one in-process prototype. It excludes networks, databases, queues, providers, and cross-service serialization.</w:t>
       </w:r>
@@ -10622,11 +10572,6 @@
     </w:tbl>
     <w:p>
       <w:pPr>
-        <w:spacing w:after="80" w:before="40"/>
-      </w:pPr>
-    </w:p>
-    <w:p>
-      <w:pPr>
         <w:pStyle w:val="Heading2"/>
       </w:pPr>
       <w:r>
@@ -11150,11 +11095,6 @@
     </w:tbl>
     <w:p>
       <w:pPr>
-        <w:spacing w:after="80" w:before="40"/>
-      </w:pPr>
-    </w:p>
-    <w:p>
-      <w:pPr>
         <w:pStyle w:val="Heading1"/>
       </w:pPr>
       <w:r>
@@ -11240,11 +11180,6 @@
         </w:tc>
       </w:tr>
     </w:tbl>
-    <w:p>
-      <w:pPr>
-        <w:spacing w:after="80" w:before="40"/>
-      </w:pPr>
-    </w:p>
     <w:p>
       <w:r>
         <w:t xml:space="preserve">The application uses one Next.js process, one in-memory Arena state, JSON model artifacts, and a JSONL audit ledger.</w:t>
@@ -11995,11 +11930,6 @@
       </w:tr>
     </w:tbl>
     <w:p>
-      <w:pPr>
-        <w:spacing w:after="80" w:before="40"/>
-      </w:pPr>
-    </w:p>
-    <w:p>
       <w:r>
         <w:br w:type="page"/>
       </w:r>
@@ -12321,7 +12251,7 @@
           <w:bCs/>
           <w:color w:val="2E74B5"/>
         </w:rPr>
-        <w:t xml:space="preserve">Public Railway URL: added after the final deployment</w:t>
+        <w:t xml:space="preserve">https://adversarial-fraud-arena-production.up.railway.app</w:t>
       </w:r>
     </w:p>
     <w:p>

</xml_diff>